<commit_message>
docs: drop sad signature column
</commit_message>
<xml_diff>
--- a/docs/part-1/VPS_Architecture_Design.docx
+++ b/docs/part-1/VPS_Architecture_Design.docx
@@ -366,9 +366,8 @@
         <w:tblLook w:firstColumn="1" w:firstRow="1" w:lastColumn="0" w:lastRow="0" w:noHBand="0" w:noVBand="1" w:val="04A0"/>
       </w:tblPr>
       <w:tblGrid>
-        <w:gridCol w:w="3168"/>
-        <w:gridCol w:w="3168"/>
-        <w:gridCol w:w="2304"/>
+        <w:gridCol w:w="4320"/>
+        <w:gridCol w:w="4320"/>
       </w:tblGrid>
       <w:tr>
         <w:trPr>
@@ -376,7 +375,7 @@
         </w:trPr>
         <w:tc>
           <w:tcPr>
-            <w:tcW w:type="dxa" w:w="3168"/>
+            <w:tcW w:type="dxa" w:w="4320"/>
             <w:shd w:val="clear" w:color="auto" w:fill="D9E2F3"/>
           </w:tcPr>
           <w:p>
@@ -396,7 +395,7 @@
         </w:tc>
         <w:tc>
           <w:tcPr>
-            <w:tcW w:type="dxa" w:w="3168"/>
+            <w:tcW w:type="dxa" w:w="4320"/>
             <w:shd w:val="clear" w:color="auto" w:fill="D9E2F3"/>
           </w:tcPr>
           <w:p>
@@ -414,31 +413,11 @@
             </w:r>
           </w:p>
         </w:tc>
-        <w:tc>
-          <w:tcPr>
-            <w:tcW w:type="dxa" w:w="2304"/>
-            <w:shd w:val="clear" w:color="auto" w:fill="D9E2F3"/>
-          </w:tcPr>
-          <w:p>
-            <w:pPr>
-              <w:spacing w:after="20" w:before="20"/>
-              <w:jc w:val="left"/>
-            </w:pPr>
-            <w:r>
-              <w:rPr>
-                <w:rFonts w:ascii="Cambria" w:hAnsi="Cambria" w:cs="Cambria" w:eastAsia="Cambria"/>
-                <w:b/>
-                <w:sz w:val="20"/>
-              </w:rPr>
-              <w:t>Signature/Date</w:t>
-            </w:r>
-          </w:p>
-        </w:tc>
-      </w:tr>
-      <w:tr>
-        <w:tc>
-          <w:tcPr>
-            <w:tcW w:type="dxa" w:w="3168"/>
+      </w:tr>
+      <w:tr>
+        <w:tc>
+          <w:tcPr>
+            <w:tcW w:type="dxa" w:w="4320"/>
           </w:tcPr>
           <w:p>
             <w:pPr>
@@ -456,7 +435,7 @@
         </w:tc>
         <w:tc>
           <w:tcPr>
-            <w:tcW w:type="dxa" w:w="3168"/>
+            <w:tcW w:type="dxa" w:w="4320"/>
           </w:tcPr>
           <w:p>
             <w:pPr>
@@ -472,22 +451,11 @@
             </w:r>
           </w:p>
         </w:tc>
-        <w:tc>
-          <w:tcPr>
-            <w:tcW w:type="dxa" w:w="2304"/>
-          </w:tcPr>
-          <w:p>
-            <w:pPr>
-              <w:spacing w:after="20" w:before="20"/>
-              <w:jc w:val="left"/>
-            </w:pPr>
-          </w:p>
-        </w:tc>
-      </w:tr>
-      <w:tr>
-        <w:tc>
-          <w:tcPr>
-            <w:tcW w:type="dxa" w:w="3168"/>
+      </w:tr>
+      <w:tr>
+        <w:tc>
+          <w:tcPr>
+            <w:tcW w:type="dxa" w:w="4320"/>
           </w:tcPr>
           <w:p>
             <w:pPr>
@@ -505,7 +473,7 @@
         </w:tc>
         <w:tc>
           <w:tcPr>
-            <w:tcW w:type="dxa" w:w="3168"/>
+            <w:tcW w:type="dxa" w:w="4320"/>
           </w:tcPr>
           <w:p>
             <w:pPr>
@@ -521,22 +489,11 @@
             </w:r>
           </w:p>
         </w:tc>
-        <w:tc>
-          <w:tcPr>
-            <w:tcW w:type="dxa" w:w="2304"/>
-          </w:tcPr>
-          <w:p>
-            <w:pPr>
-              <w:spacing w:after="20" w:before="20"/>
-              <w:jc w:val="left"/>
-            </w:pPr>
-          </w:p>
-        </w:tc>
-      </w:tr>
-      <w:tr>
-        <w:tc>
-          <w:tcPr>
-            <w:tcW w:type="dxa" w:w="3168"/>
+      </w:tr>
+      <w:tr>
+        <w:tc>
+          <w:tcPr>
+            <w:tcW w:type="dxa" w:w="4320"/>
           </w:tcPr>
           <w:p>
             <w:pPr>
@@ -554,7 +511,7 @@
         </w:tc>
         <w:tc>
           <w:tcPr>
-            <w:tcW w:type="dxa" w:w="3168"/>
+            <w:tcW w:type="dxa" w:w="4320"/>
           </w:tcPr>
           <w:p>
             <w:pPr>
@@ -570,22 +527,11 @@
             </w:r>
           </w:p>
         </w:tc>
-        <w:tc>
-          <w:tcPr>
-            <w:tcW w:type="dxa" w:w="2304"/>
-          </w:tcPr>
-          <w:p>
-            <w:pPr>
-              <w:spacing w:after="20" w:before="20"/>
-              <w:jc w:val="left"/>
-            </w:pPr>
-          </w:p>
-        </w:tc>
-      </w:tr>
-      <w:tr>
-        <w:tc>
-          <w:tcPr>
-            <w:tcW w:type="dxa" w:w="3168"/>
+      </w:tr>
+      <w:tr>
+        <w:tc>
+          <w:tcPr>
+            <w:tcW w:type="dxa" w:w="4320"/>
           </w:tcPr>
           <w:p>
             <w:pPr>
@@ -603,7 +549,7 @@
         </w:tc>
         <w:tc>
           <w:tcPr>
-            <w:tcW w:type="dxa" w:w="3168"/>
+            <w:tcW w:type="dxa" w:w="4320"/>
           </w:tcPr>
           <w:p>
             <w:pPr>
@@ -619,22 +565,11 @@
             </w:r>
           </w:p>
         </w:tc>
-        <w:tc>
-          <w:tcPr>
-            <w:tcW w:type="dxa" w:w="2304"/>
-          </w:tcPr>
-          <w:p>
-            <w:pPr>
-              <w:spacing w:after="20" w:before="20"/>
-              <w:jc w:val="left"/>
-            </w:pPr>
-          </w:p>
-        </w:tc>
-      </w:tr>
-      <w:tr>
-        <w:tc>
-          <w:tcPr>
-            <w:tcW w:type="dxa" w:w="3168"/>
+      </w:tr>
+      <w:tr>
+        <w:tc>
+          <w:tcPr>
+            <w:tcW w:type="dxa" w:w="4320"/>
           </w:tcPr>
           <w:p>
             <w:pPr>
@@ -652,18 +587,7 @@
         </w:tc>
         <w:tc>
           <w:tcPr>
-            <w:tcW w:type="dxa" w:w="3168"/>
-          </w:tcPr>
-          <w:p>
-            <w:pPr>
-              <w:spacing w:after="20" w:before="20"/>
-              <w:jc w:val="left"/>
-            </w:pPr>
-          </w:p>
-        </w:tc>
-        <w:tc>
-          <w:tcPr>
-            <w:tcW w:type="dxa" w:w="2304"/>
+            <w:tcW w:type="dxa" w:w="4320"/>
           </w:tcPr>
           <w:p>
             <w:pPr>

</xml_diff>